<commit_message>
Update: cambio al docs del informe
</commit_message>
<xml_diff>
--- a/Informe/Informe Proyecto Libreria Rex.docx
+++ b/Informe/Informe Proyecto Libreria Rex.docx
@@ -278,67 +278,6 @@
     </w:p>
     <w:p>
       <w:pPr>
-        <w:rPr>
-          <w:b w:val="1"/>
-          <w:bCs w:val="1"/>
-          <w:sz w:val="24"/>
-          <w:szCs w:val="24"/>
-        </w:rPr>
-      </w:pPr>
-      <w:r>
-        <w:br w:type="page"/>
-      </w:r>
-      <w:r>
-        <w:rPr>
-          <w:rtl w:val="0"/>
-        </w:rPr>
-      </w:r>
-    </w:p>
-    <w:p>
-      <w:pPr>
-        <w:pStyle w:val="Heading1"/>
-        <w:jc w:val="both"/>
-        <w:rPr/>
-      </w:pPr>
-      <w:bookmarkStart w:colFirst="0" w:colLast="0" w:name="_s66fabcdo7lu" w:id="1"/>
-      <w:bookmarkEnd w:id="1"/>
-      <w:r>
-        <w:rPr>
-          <w:rtl w:val="0"/>
-        </w:rPr>
-      </w:r>
-    </w:p>
-    <w:p>
-      <w:pPr>
-        <w:jc w:val="both"/>
-        <w:rPr>
-          <w:sz w:val="24"/>
-          <w:szCs w:val="24"/>
-        </w:rPr>
-      </w:pPr>
-      <w:r>
-        <w:rPr>
-          <w:rtl w:val="0"/>
-        </w:rPr>
-      </w:r>
-    </w:p>
-    <w:p>
-      <w:pPr>
-        <w:ind w:left="0" w:firstLine="0"/>
-        <w:jc w:val="both"/>
-        <w:rPr>
-          <w:sz w:val="24"/>
-          <w:szCs w:val="24"/>
-        </w:rPr>
-      </w:pPr>
-      <w:r>
-        <w:rPr>
-          <w:rtl w:val="0"/>
-        </w:rPr>
-      </w:r>
-    </w:p>
-    <w:p>
-      <w:pPr>
         <w:jc w:val="both"/>
         <w:rPr>
           <w:sz w:val="24"/>
@@ -1239,8 +1178,8 @@
           <w:szCs w:val="24"/>
         </w:rPr>
       </w:pPr>
-      <w:bookmarkStart w:colFirst="0" w:colLast="0" w:name="_52dw4d4oxi1v" w:id="2"/>
-      <w:bookmarkEnd w:id="2"/>
+      <w:bookmarkStart w:colFirst="0" w:colLast="0" w:name="_52dw4d4oxi1v" w:id="1"/>
+      <w:bookmarkEnd w:id="1"/>
       <w:r>
         <w:rPr>
           <w:b w:val="1"/>
@@ -1671,12 +1610,12 @@
           <wp:inline distB="114300" distT="114300" distL="114300" distR="114300">
             <wp:extent cx="5731200" cy="8115300"/>
             <wp:effectExtent b="0" l="0" r="0" t="0"/>
-            <wp:docPr id="4" name="image6.png"/>
+            <wp:docPr id="4" name="image4.png"/>
             <a:graphic>
               <a:graphicData uri="http://schemas.openxmlformats.org/drawingml/2006/picture">
                 <pic:pic>
                   <pic:nvPicPr>
-                    <pic:cNvPr id="0" name="image6.png"/>
+                    <pic:cNvPr id="0" name="image4.png"/>
                     <pic:cNvPicPr preferRelativeResize="0"/>
                   </pic:nvPicPr>
                   <pic:blipFill>
@@ -1761,12 +1700,12 @@
           <wp:inline distB="114300" distT="114300" distL="114300" distR="114300">
             <wp:extent cx="5731200" cy="6184900"/>
             <wp:effectExtent b="0" l="0" r="0" t="0"/>
-            <wp:docPr id="2" name="image4.png"/>
+            <wp:docPr id="2" name="image7.png"/>
             <a:graphic>
               <a:graphicData uri="http://schemas.openxmlformats.org/drawingml/2006/picture">
                 <pic:pic>
                   <pic:nvPicPr>
-                    <pic:cNvPr id="0" name="image4.png"/>
+                    <pic:cNvPr id="0" name="image7.png"/>
                     <pic:cNvPicPr preferRelativeResize="0"/>
                   </pic:nvPicPr>
                   <pic:blipFill>
@@ -1861,12 +1800,12 @@
             <wp:extent cx="6838950" cy="4575256"/>
             <wp:effectExtent b="0" l="0" r="0" t="0"/>
             <wp:wrapNone/>
-            <wp:docPr id="1" name="image7.png"/>
+            <wp:docPr id="1" name="image6.png"/>
             <a:graphic>
               <a:graphicData uri="http://schemas.openxmlformats.org/drawingml/2006/picture">
                 <pic:pic>
                   <pic:nvPicPr>
-                    <pic:cNvPr id="0" name="image7.png"/>
+                    <pic:cNvPr id="0" name="image6.png"/>
                     <pic:cNvPicPr preferRelativeResize="0"/>
                   </pic:nvPicPr>
                   <pic:blipFill>
@@ -3538,6 +3477,52 @@
         </w:rPr>
         <w:t xml:space="preserve">Usaré la plataforma de GitHub para llevar el las versiones de mi aplicación, así teniendo todo organizado y pudiendo tener una forma rápida de compartir mis avances y mostrar el proyecto.</w:t>
       </w:r>
+      <w:hyperlink r:id="rId12">
+        <w:r>
+          <w:rPr>
+            <w:color w:val="1155cc"/>
+            <w:sz w:val="24"/>
+            <w:szCs w:val="24"/>
+            <w:u w:val="single"/>
+            <w:rtl w:val="0"/>
+          </w:rPr>
+          <w:t xml:space="preserve">https://github.com/Jeronimo03/Taller-de-Integracion</w:t>
+        </w:r>
+      </w:hyperlink>
+      <w:r>
+        <w:rPr>
+          <w:rtl w:val="0"/>
+        </w:rPr>
+      </w:r>
+    </w:p>
+    <w:p>
+      <w:pPr>
+        <w:ind w:left="0" w:firstLine="0"/>
+        <w:jc w:val="both"/>
+        <w:rPr>
+          <w:sz w:val="24"/>
+          <w:szCs w:val="24"/>
+        </w:rPr>
+      </w:pPr>
+      <w:r>
+        <w:rPr>
+          <w:b w:val="1"/>
+          <w:bCs w:val="1"/>
+          <w:sz w:val="24"/>
+          <w:szCs w:val="24"/>
+          <w:rtl w:val="0"/>
+        </w:rPr>
+        <w:t xml:space="preserve">Mermaid</w:t>
+        <w:br w:type="textWrapping"/>
+      </w:r>
+      <w:r>
+        <w:rPr>
+          <w:sz w:val="24"/>
+          <w:szCs w:val="24"/>
+          <w:rtl w:val="0"/>
+        </w:rPr>
+        <w:t xml:space="preserve">Uso de esta página web para la generación de los diagramas.</w:t>
+      </w:r>
     </w:p>
     <w:p>
       <w:pPr>
@@ -3645,7 +3630,7 @@
                     <pic:cNvPicPr preferRelativeResize="0"/>
                   </pic:nvPicPr>
                   <pic:blipFill>
-                    <a:blip r:embed="rId12"/>
+                    <a:blip r:embed="rId13"/>
                     <a:srcRect b="0" l="0" r="0" t="0"/>
                     <a:stretch>
                       <a:fillRect/>
@@ -3667,9 +3652,9 @@
       </w:r>
     </w:p>
     <w:sectPr>
-      <w:headerReference r:id="rId13" w:type="default"/>
-      <w:footerReference r:id="rId14" w:type="default"/>
-      <w:footerReference r:id="rId15" w:type="first"/>
+      <w:headerReference r:id="rId14" w:type="default"/>
+      <w:footerReference r:id="rId15" w:type="default"/>
+      <w:footerReference r:id="rId16" w:type="first"/>
       <w:pgSz w:h="16834" w:w="11909" w:orient="portrait"/>
       <w:pgMar w:bottom="1440" w:top="1440" w:left="1440" w:right="1440" w:header="720" w:footer="720"/>
       <w:pgNumType w:start="0"/>

</xml_diff>